<commit_message>
Update Group Member Contribution Form.docx
</commit_message>
<xml_diff>
--- a/documents/Group Member Contribution Form.docx
+++ b/documents/Group Member Contribution Form.docx
@@ -798,8 +798,6 @@
         <w:spacing w:line="240" w:lineRule="auto"/>
         <w:jc w:val="left"/>
       </w:pPr>
-      <w:bookmarkStart w:id="0" w:name="_GoBack"/>
-      <w:bookmarkEnd w:id="0"/>
     </w:p>
     <w:p>
       <w:pPr>
@@ -979,7 +977,7 @@
                 <w:rFonts w:hint="eastAsia"/>
                 <w:lang w:val="en-US" w:eastAsia="zh-CN"/>
               </w:rPr>
-              <w:t>I am responsible for providing all the contents(including all the texts and pictures) for my teammates to make the final powerpoint.</w:t>
+              <w:t>I am responsible for providing the contents (including the texts and pictures) for my teammates to make the final powerpoint.I also explained the texture mapping, shaders as well as animation system that I developed for the project during presentation.</w:t>
             </w:r>
           </w:p>
         </w:tc>
@@ -1249,7 +1247,18 @@
           <w:p>
             <w:pPr>
               <w:jc w:val="left"/>
-            </w:pPr>
+              <w:rPr>
+                <w:rFonts w:hint="default" w:eastAsia="MicrosoftYaHei"/>
+                <w:lang w:val="en-US" w:eastAsia="zh-CN"/>
+              </w:rPr>
+            </w:pPr>
+            <w:r>
+              <w:rPr>
+                <w:rFonts w:hint="eastAsia"/>
+                <w:lang w:val="en-US" w:eastAsia="zh-CN"/>
+              </w:rPr>
+              <w:t xml:space="preserve">Ziqi Guo </w:t>
+            </w:r>
           </w:p>
         </w:tc>
       </w:tr>
@@ -1319,7 +1328,18 @@
           <w:p>
             <w:pPr>
               <w:jc w:val="left"/>
-            </w:pPr>
+              <w:rPr>
+                <w:rFonts w:hint="default"/>
+                <w:lang w:val="en-US"/>
+              </w:rPr>
+            </w:pPr>
+            <w:r>
+              <w:rPr>
+                <w:rFonts w:hint="eastAsia"/>
+                <w:lang w:val="en-US" w:eastAsia="zh-CN"/>
+              </w:rPr>
+              <w:t>Was responsible for providing files and photo evidence for the presentation, was in charge of explaining the modelling part of the project.</w:t>
+            </w:r>
           </w:p>
         </w:tc>
       </w:tr>
@@ -1381,7 +1401,18 @@
           <w:p>
             <w:pPr>
               <w:jc w:val="left"/>
-            </w:pPr>
+              <w:rPr>
+                <w:rFonts w:hint="default" w:eastAsia="MicrosoftYaHei"/>
+                <w:lang w:val="en-US" w:eastAsia="zh-CN"/>
+              </w:rPr>
+            </w:pPr>
+            <w:r>
+              <w:rPr>
+                <w:rFonts w:hint="eastAsia"/>
+                <w:lang w:val="en-US" w:eastAsia="zh-CN"/>
+              </w:rPr>
+              <w:t>Was responsible for providing files and photo evidence for the report</w:t>
+            </w:r>
           </w:p>
         </w:tc>
       </w:tr>
@@ -1443,7 +1474,18 @@
           <w:p>
             <w:pPr>
               <w:jc w:val="both"/>
-            </w:pPr>
+              <w:rPr>
+                <w:rFonts w:hint="default" w:eastAsia="MicrosoftYaHei"/>
+                <w:lang w:val="en-US" w:eastAsia="zh-CN"/>
+              </w:rPr>
+            </w:pPr>
+            <w:r>
+              <w:rPr>
+                <w:rFonts w:hint="eastAsia"/>
+                <w:lang w:val="en-US" w:eastAsia="zh-CN"/>
+              </w:rPr>
+              <w:t>Made the template model for the cookie in OpenSCAD and exported the STL file for further texture mapping.</w:t>
+            </w:r>
           </w:p>
           <w:p>
             <w:pPr>
@@ -1539,7 +1581,18 @@
           <w:p>
             <w:pPr>
               <w:jc w:val="left"/>
-            </w:pPr>
+              <w:rPr>
+                <w:rFonts w:hint="default" w:eastAsia="MicrosoftYaHei"/>
+                <w:lang w:val="en-US" w:eastAsia="zh-CN"/>
+              </w:rPr>
+            </w:pPr>
+            <w:r>
+              <w:rPr>
+                <w:rFonts w:hint="eastAsia"/>
+                <w:lang w:val="en-US" w:eastAsia="zh-CN"/>
+              </w:rPr>
+              <w:t>Ziang Chen</w:t>
+            </w:r>
           </w:p>
         </w:tc>
       </w:tr>
@@ -1609,7 +1662,18 @@
           <w:p>
             <w:pPr>
               <w:jc w:val="left"/>
-            </w:pPr>
+              <w:rPr>
+                <w:rFonts w:hint="default" w:eastAsia="MicrosoftYaHei"/>
+                <w:lang w:val="en-US" w:eastAsia="zh-CN"/>
+              </w:rPr>
+            </w:pPr>
+            <w:r>
+              <w:rPr>
+                <w:rFonts w:hint="eastAsia"/>
+                <w:lang w:val="en-US" w:eastAsia="zh-CN"/>
+              </w:rPr>
+              <w:t xml:space="preserve">Compiled all of the contents sent by teammates, paraphrased the keypoints and techincal approaches and completed the final powerpoint, </w:t>
+            </w:r>
           </w:p>
         </w:tc>
       </w:tr>
@@ -1671,7 +1735,18 @@
           <w:p>
             <w:pPr>
               <w:jc w:val="left"/>
-            </w:pPr>
+              <w:rPr>
+                <w:rFonts w:hint="default" w:eastAsia="MicrosoftYaHei"/>
+                <w:lang w:val="en-US" w:eastAsia="zh-CN"/>
+              </w:rPr>
+            </w:pPr>
+            <w:r>
+              <w:rPr>
+                <w:rFonts w:hint="eastAsia"/>
+                <w:lang w:val="en-US" w:eastAsia="zh-CN"/>
+              </w:rPr>
+              <w:t>did proofreading for the final report</w:t>
+            </w:r>
           </w:p>
         </w:tc>
       </w:tr>
@@ -1733,7 +1808,20 @@
           <w:p>
             <w:pPr>
               <w:jc w:val="both"/>
-            </w:pPr>
+              <w:rPr>
+                <w:rFonts w:hint="default" w:eastAsia="MicrosoftYaHei"/>
+                <w:lang w:val="en-US" w:eastAsia="zh-CN"/>
+              </w:rPr>
+            </w:pPr>
+            <w:r>
+              <w:rPr>
+                <w:rFonts w:hint="eastAsia"/>
+                <w:lang w:val="en-US" w:eastAsia="zh-CN"/>
+              </w:rPr>
+              <w:t>Recorded the video evidence for the project, produced the final presentation powerpoint based on the files that teammates provided, checked the codes for models, shaders and animations before running in Three.js</w:t>
+            </w:r>
+            <w:bookmarkStart w:id="0" w:name="_GoBack"/>
+            <w:bookmarkEnd w:id="0"/>
           </w:p>
           <w:p>
             <w:pPr>

</xml_diff>